<commit_message>
Updated news and changed pubs ordering
</commit_message>
<xml_diff>
--- a/docs/Academic CV Ulf Jakob Flø Aarsnes.docx
+++ b/docs/Academic CV Ulf Jakob Flø Aarsnes.docx
@@ -113,7 +113,6 @@
                 <w:szCs w:val="22"/>
               </w:rPr>
             </w:pPr>
-            <w:proofErr w:type="spellStart"/>
             <w:r>
               <w:rPr>
                 <w:rFonts w:ascii="Times New Roman" w:hAnsi="Times New Roman"/>
@@ -122,18 +121,7 @@
                 <w:sz w:val="22"/>
                 <w:szCs w:val="22"/>
               </w:rPr>
-              <w:t>Tullins</w:t>
-            </w:r>
-            <w:proofErr w:type="spellEnd"/>
-            <w:r>
-              <w:rPr>
-                <w:rFonts w:ascii="Times New Roman" w:hAnsi="Times New Roman"/>
-                <w:b w:val="0"/>
-                <w:bCs w:val="0"/>
-                <w:sz w:val="22"/>
-                <w:szCs w:val="22"/>
-              </w:rPr>
-              <w:t xml:space="preserve"> Gate 2</w:t>
+              <w:t>Sognsveien 72</w:t>
             </w:r>
             <w:r>
               <w:rPr>
@@ -163,17 +151,7 @@
                 <w:sz w:val="22"/>
                 <w:szCs w:val="22"/>
               </w:rPr>
-              <w:t>0</w:t>
-            </w:r>
-            <w:r>
-              <w:rPr>
-                <w:rFonts w:ascii="Times New Roman" w:hAnsi="Times New Roman"/>
-                <w:b w:val="0"/>
-                <w:bCs w:val="0"/>
-                <w:sz w:val="22"/>
-                <w:szCs w:val="22"/>
-              </w:rPr>
-              <w:t>166</w:t>
+              <w:t>0855</w:t>
             </w:r>
             <w:r>
               <w:rPr>
@@ -362,21 +340,7 @@
           <w:lang w:val="nb-NO"/>
         </w:rPr>
         <w:tab/>
-        <w:t xml:space="preserve">Professor Ole Morten Aamo (NTNU) and Professor Glenn Ole Kaasa (NTNU, </w:t>
-      </w:r>
-      <w:proofErr w:type="spellStart"/>
-      <w:r>
-        <w:rPr>
-          <w:lang w:val="nb-NO"/>
-        </w:rPr>
-        <w:t>Kelda</w:t>
-      </w:r>
-      <w:proofErr w:type="spellEnd"/>
-      <w:r>
-        <w:rPr>
-          <w:lang w:val="nb-NO"/>
-        </w:rPr>
-        <w:t>).</w:t>
+        <w:t>Professor Ole Morten Aamo (NTNU) and Professor Glenn Ole Kaasa (NTNU, Kelda).</w:t>
       </w:r>
     </w:p>
     <w:p>
@@ -775,23 +739,7 @@
           <w:i/>
           <w:iCs/>
         </w:rPr>
-        <w:t xml:space="preserve">Marie </w:t>
-      </w:r>
-      <w:proofErr w:type="spellStart"/>
-      <w:r>
-        <w:rPr>
-          <w:i/>
-          <w:iCs/>
-        </w:rPr>
-        <w:t>Skłodowska</w:t>
-      </w:r>
-      <w:proofErr w:type="spellEnd"/>
-      <w:r>
-        <w:rPr>
-          <w:i/>
-          <w:iCs/>
-        </w:rPr>
-        <w:t xml:space="preserve">-Curie </w:t>
+        <w:t xml:space="preserve">Marie Skłodowska-Curie </w:t>
       </w:r>
       <w:r>
         <w:rPr>
@@ -868,23 +816,7 @@
           <w:i/>
           <w:iCs/>
         </w:rPr>
-        <w:t xml:space="preserve">Marie </w:t>
-      </w:r>
-      <w:proofErr w:type="spellStart"/>
-      <w:r>
-        <w:rPr>
-          <w:i/>
-          <w:iCs/>
-        </w:rPr>
-        <w:t>Skłodowska</w:t>
-      </w:r>
-      <w:proofErr w:type="spellEnd"/>
-      <w:r>
-        <w:rPr>
-          <w:i/>
-          <w:iCs/>
-        </w:rPr>
-        <w:t xml:space="preserve">-Curie </w:t>
+        <w:t xml:space="preserve">Marie Skłodowska-Curie </w:t>
       </w:r>
       <w:r>
         <w:rPr>
@@ -1292,86 +1224,62 @@
           <w:b/>
           <w:bCs/>
         </w:rPr>
-        <w:t>Theory</w:t>
-      </w:r>
-      <w:proofErr w:type="gramStart"/>
-      <w:r>
+        <w:t>Theory:</w:t>
+      </w:r>
+      <w:r>
+        <w:t xml:space="preserve"> </w:t>
+      </w:r>
+      <w:r>
+        <w:tab/>
+      </w:r>
+      <w:r>
+        <w:t xml:space="preserve">Machine Learning, </w:t>
+      </w:r>
+      <w:r>
+        <w:t xml:space="preserve">Control and Estimation, </w:t>
+      </w:r>
+      <w:r>
+        <w:t>O</w:t>
+      </w:r>
+      <w:r>
+        <w:t xml:space="preserve">ptimization, </w:t>
+      </w:r>
+      <w:r>
+        <w:t>D</w:t>
+      </w:r>
+      <w:r>
+        <w:t xml:space="preserve">ata </w:t>
+      </w:r>
+      <w:r>
+        <w:t>S</w:t>
+      </w:r>
+      <w:r>
+        <w:t>cience.</w:t>
+      </w:r>
+    </w:p>
+    <w:p>
+      <w:pPr>
         <w:rPr>
           <w:b/>
           <w:bCs/>
         </w:rPr>
-        <w:t>:</w:t>
-      </w:r>
-      <w:r>
-        <w:t xml:space="preserve"> </w:t>
-      </w:r>
-      <w:r>
-        <w:tab/>
-      </w:r>
-      <w:r>
-        <w:t>Machine</w:t>
-      </w:r>
-      <w:proofErr w:type="gramEnd"/>
-      <w:r>
-        <w:t xml:space="preserve"> Learning, </w:t>
-      </w:r>
-      <w:r>
-        <w:t xml:space="preserve">Control and Estimation, </w:t>
-      </w:r>
-      <w:r>
-        <w:t>O</w:t>
-      </w:r>
-      <w:r>
-        <w:t xml:space="preserve">ptimization, </w:t>
-      </w:r>
-      <w:r>
-        <w:t>D</w:t>
-      </w:r>
-      <w:r>
-        <w:t xml:space="preserve">ata </w:t>
-      </w:r>
-      <w:r>
-        <w:t>S</w:t>
-      </w:r>
-      <w:r>
-        <w:t>cience.</w:t>
-      </w:r>
-    </w:p>
-    <w:p>
-      <w:pPr>
+      </w:pPr>
+      <w:r>
         <w:rPr>
           <w:b/>
           <w:bCs/>
         </w:rPr>
-      </w:pPr>
+        <w:t xml:space="preserve">Applications: </w:t>
+      </w:r>
       <w:r>
         <w:rPr>
           <w:b/>
           <w:bCs/>
         </w:rPr>
-        <w:t>Applications</w:t>
-      </w:r>
-      <w:proofErr w:type="gramStart"/>
-      <w:r>
-        <w:rPr>
-          <w:b/>
-          <w:bCs/>
-        </w:rPr>
-        <w:t xml:space="preserve">: </w:t>
-      </w:r>
-      <w:r>
-        <w:rPr>
-          <w:b/>
-          <w:bCs/>
-        </w:rPr>
-        <w:tab/>
-      </w:r>
-      <w:r>
-        <w:t>Energy</w:t>
-      </w:r>
-      <w:proofErr w:type="gramEnd"/>
-      <w:r>
-        <w:t xml:space="preserve"> systems</w:t>
+        <w:tab/>
+      </w:r>
+      <w:r>
+        <w:t>Energy systems</w:t>
       </w:r>
       <w:r>
         <w:t xml:space="preserve">, Business Optimization, </w:t>
@@ -1405,13 +1313,19 @@
     </w:p>
     <w:p>
       <w:r>
-        <w:t xml:space="preserve">1633 </w:t>
+        <w:t>1789</w:t>
+      </w:r>
+      <w:r>
+        <w:t xml:space="preserve"> </w:t>
       </w:r>
       <w:r>
         <w:t xml:space="preserve">citations, h-index = </w:t>
       </w:r>
       <w:r>
-        <w:t>28</w:t>
+        <w:t>2</w:t>
+      </w:r>
+      <w:r>
+        <w:t>9</w:t>
       </w:r>
       <w:r>
         <w:t xml:space="preserve"> (</w:t>
@@ -1428,7 +1342,7 @@
         <w:t xml:space="preserve">, </w:t>
       </w:r>
       <w:r>
-        <w:t>Feb</w:t>
+        <w:t>Sep</w:t>
       </w:r>
       <w:r>
         <w:t>. 202</w:t>
@@ -1474,21 +1388,7 @@
         <w:rPr>
           <w:i/>
         </w:rPr>
-        <w:t xml:space="preserve"> SPE Drill. </w:t>
-      </w:r>
-      <w:proofErr w:type="spellStart"/>
-      <w:r>
-        <w:rPr>
-          <w:i/>
-        </w:rPr>
-        <w:t>Complet</w:t>
-      </w:r>
-      <w:proofErr w:type="spellEnd"/>
-      <w:r>
-        <w:rPr>
-          <w:i/>
-        </w:rPr>
-        <w:t>.</w:t>
+        <w:t xml:space="preserve"> SPE Drill. Complet.</w:t>
       </w:r>
       <w:r>
         <w:t>, vol. 29, no.04, pp. 454</w:t>
@@ -1595,15 +1495,7 @@
         <w:t>U. J. F. Aarsnes</w:t>
       </w:r>
       <w:r>
-        <w:t xml:space="preserve">, A. Karimi </w:t>
-      </w:r>
-      <w:proofErr w:type="spellStart"/>
-      <w:r>
-        <w:t>Vajargah</w:t>
-      </w:r>
-      <w:proofErr w:type="spellEnd"/>
-      <w:r>
-        <w:t xml:space="preserve">, B. Akbari, E. van Oort, and O. M. Aamo, “Real-Time Estimation of Reservoir Influx Rate and Pore Pressure Using a Simplified Transient Two-Phase Flow Model for Managed Pressure Drilling Operations,” </w:t>
+        <w:t xml:space="preserve">, A. Karimi Vajargah, B. Akbari, E. van Oort, and O. M. Aamo, “Real-Time Estimation of Reservoir Influx Rate and Pore Pressure Using a Simplified Transient Two-Phase Flow Model for Managed Pressure Drilling Operations,” </w:t>
       </w:r>
       <w:r>
         <w:rPr>
@@ -1638,15 +1530,7 @@
         <w:t>B.</w:t>
       </w:r>
       <w:r>
-        <w:t xml:space="preserve"> </w:t>
-      </w:r>
-      <w:proofErr w:type="spellStart"/>
-      <w:r>
-        <w:t>Acikmese</w:t>
-      </w:r>
-      <w:proofErr w:type="spellEnd"/>
-      <w:r>
-        <w:t xml:space="preserve">, </w:t>
+        <w:t xml:space="preserve"> Acikmese, </w:t>
       </w:r>
       <w:r>
         <w:t xml:space="preserve">A. </w:t>
@@ -1722,15 +1606,7 @@
         <w:t>A</w:t>
       </w:r>
       <w:r>
-        <w:t xml:space="preserve">. Karimi </w:t>
-      </w:r>
-      <w:proofErr w:type="spellStart"/>
-      <w:r>
-        <w:t>Vajargah</w:t>
-      </w:r>
-      <w:proofErr w:type="spellEnd"/>
-      <w:r>
-        <w:t xml:space="preserve">, </w:t>
+        <w:t xml:space="preserve">. Karimi Vajargah, </w:t>
       </w:r>
       <w:r>
         <w:t>E.</w:t>
@@ -1778,16 +1654,8 @@
         <w:rPr>
           <w:i/>
         </w:rPr>
-        <w:t xml:space="preserve"> of </w:t>
-      </w:r>
-      <w:proofErr w:type="spellStart"/>
-      <w:r>
-        <w:rPr>
-          <w:i/>
-        </w:rPr>
-        <w:t>Multiph</w:t>
-      </w:r>
-      <w:proofErr w:type="spellEnd"/>
+        <w:t xml:space="preserve"> of Multiph</w:t>
+      </w:r>
       <w:r>
         <w:rPr>
           <w:i/>
@@ -1860,15 +1728,7 @@
         <w:t xml:space="preserve">, </w:t>
       </w:r>
       <w:r>
-        <w:t xml:space="preserve">vol. 42, pp. </w:t>
-      </w:r>
-      <w:proofErr w:type="gramStart"/>
-      <w:r>
-        <w:t>50--62</w:t>
-      </w:r>
-      <w:proofErr w:type="gramEnd"/>
-      <w:r>
-        <w:t>, Jul. 2016.</w:t>
+        <w:t>vol. 42, pp. 50--62, Jul. 2016.</w:t>
       </w:r>
     </w:p>
     <w:p>
@@ -1881,15 +1741,7 @@
         <w:jc w:val="both"/>
       </w:pPr>
       <w:r>
-        <w:t xml:space="preserve">A. </w:t>
-      </w:r>
-      <w:proofErr w:type="spellStart"/>
-      <w:r>
-        <w:t>Nikoofard</w:t>
-      </w:r>
-      <w:proofErr w:type="spellEnd"/>
-      <w:r>
-        <w:t xml:space="preserve">, </w:t>
+        <w:t xml:space="preserve">A. Nikoofard, </w:t>
       </w:r>
       <w:r>
         <w:rPr>
@@ -2144,16 +1996,8 @@
         <w:rPr>
           <w:i/>
         </w:rPr>
-        <w:t xml:space="preserve"> of </w:t>
-      </w:r>
-      <w:proofErr w:type="spellStart"/>
-      <w:r>
-        <w:rPr>
-          <w:i/>
-        </w:rPr>
-        <w:t>Multiph</w:t>
-      </w:r>
-      <w:proofErr w:type="spellEnd"/>
+        <w:t xml:space="preserve"> of Multiph</w:t>
+      </w:r>
       <w:r>
         <w:rPr>
           <w:i/>
@@ -2455,21 +2299,12 @@
       <w:r>
         <w:t xml:space="preserve"> </w:t>
       </w:r>
-      <w:proofErr w:type="spellStart"/>
-      <w:r>
-        <w:rPr>
-          <w:i/>
-          <w:iCs/>
-        </w:rPr>
-        <w:t>Automatica</w:t>
-      </w:r>
-      <w:proofErr w:type="spellEnd"/>
-      <w:r>
-        <w:rPr>
-          <w:i/>
-          <w:iCs/>
-        </w:rPr>
-        <w:t>,</w:t>
+      <w:r>
+        <w:rPr>
+          <w:i/>
+          <w:iCs/>
+        </w:rPr>
+        <w:t>Automatica,</w:t>
       </w:r>
       <w:r>
         <w:t xml:space="preserve"> vol. 119, 2020</w:t>
@@ -2503,15 +2338,7 @@
         <w:t xml:space="preserve"> Meglio</w:t>
       </w:r>
       <w:r>
-        <w:t xml:space="preserve">, “Closed-loop </w:t>
-      </w:r>
-      <w:proofErr w:type="spellStart"/>
-      <w:r>
-        <w:t>toolface</w:t>
-      </w:r>
-      <w:proofErr w:type="spellEnd"/>
-      <w:r>
-        <w:t xml:space="preserve"> control with the bit off-bottom,” </w:t>
+        <w:t xml:space="preserve">, “Closed-loop toolface control with the bit off-bottom,” </w:t>
       </w:r>
       <w:r>
         <w:rPr>
@@ -2664,15 +2491,7 @@
           <w:i/>
           <w:iCs/>
         </w:rPr>
-        <w:t xml:space="preserve">IEEE </w:t>
-      </w:r>
-      <w:proofErr w:type="spellStart"/>
-      <w:r>
-        <w:rPr>
-          <w:i/>
-          <w:iCs/>
-        </w:rPr>
-        <w:t>Contr</w:t>
+        <w:t>IEEE Contr</w:t>
       </w:r>
       <w:r>
         <w:rPr>
@@ -2681,7 +2500,6 @@
         </w:rPr>
         <w:t>l</w:t>
       </w:r>
-      <w:proofErr w:type="spellEnd"/>
       <w:r>
         <w:rPr>
           <w:i/>
@@ -2870,15 +2688,7 @@
         <w:t xml:space="preserve"> “</w:t>
       </w:r>
       <w:r>
-        <w:t xml:space="preserve">Boundary Control and Estimation for Underbalanced Drilling </w:t>
-      </w:r>
-      <w:proofErr w:type="gramStart"/>
-      <w:r>
-        <w:t>With</w:t>
-      </w:r>
-      <w:proofErr w:type="gramEnd"/>
-      <w:r>
-        <w:t xml:space="preserve"> Uncertain Reservoir Parameters</w:t>
+        <w:t>Boundary Control and Estimation for Underbalanced Drilling With Uncertain Reservoir Parameters</w:t>
       </w:r>
       <w:r>
         <w:t>,</w:t>
@@ -2955,21 +2765,12 @@
       <w:r>
         <w:t xml:space="preserve">,” </w:t>
       </w:r>
-      <w:proofErr w:type="spellStart"/>
-      <w:r>
-        <w:rPr>
-          <w:i/>
-          <w:iCs/>
-        </w:rPr>
-        <w:t>Geoenergy</w:t>
-      </w:r>
-      <w:proofErr w:type="spellEnd"/>
-      <w:r>
-        <w:rPr>
-          <w:i/>
-          <w:iCs/>
-        </w:rPr>
-        <w:t xml:space="preserve"> Science and Engineering, </w:t>
+      <w:r>
+        <w:rPr>
+          <w:i/>
+          <w:iCs/>
+        </w:rPr>
+        <w:t xml:space="preserve">Geoenergy Science and Engineering, </w:t>
       </w:r>
       <w:r>
         <w:t>vol.</w:t>
@@ -3171,35 +2972,7 @@
         <w:rPr>
           <w:bCs/>
         </w:rPr>
-        <w:t xml:space="preserve">S. </w:t>
-      </w:r>
-      <w:proofErr w:type="spellStart"/>
-      <w:r>
-        <w:rPr>
-          <w:bCs/>
-        </w:rPr>
-        <w:t>Landet</w:t>
-      </w:r>
-      <w:proofErr w:type="spellEnd"/>
-      <w:r>
-        <w:rPr>
-          <w:bCs/>
-        </w:rPr>
-        <w:t xml:space="preserve">, H. </w:t>
-      </w:r>
-      <w:proofErr w:type="spellStart"/>
-      <w:r>
-        <w:rPr>
-          <w:bCs/>
-        </w:rPr>
-        <w:t>Mahdianfar</w:t>
-      </w:r>
-      <w:proofErr w:type="spellEnd"/>
-      <w:r>
-        <w:rPr>
-          <w:bCs/>
-        </w:rPr>
-        <w:t xml:space="preserve">, </w:t>
+        <w:t xml:space="preserve">S. Landet, H. Mahdianfar, </w:t>
       </w:r>
       <w:r>
         <w:rPr>
@@ -3226,19 +2999,11 @@
         </w:rPr>
         <w:t xml:space="preserve"> </w:t>
       </w:r>
-      <w:proofErr w:type="gramStart"/>
       <w:r>
         <w:rPr>
           <w:bCs/>
         </w:rPr>
-        <w:t>With</w:t>
-      </w:r>
-      <w:proofErr w:type="gramEnd"/>
-      <w:r>
-        <w:rPr>
-          <w:bCs/>
-        </w:rPr>
-        <w:t xml:space="preserve"> Experimental Validation,” in </w:t>
+        <w:t xml:space="preserve">With Experimental Validation,” in </w:t>
       </w:r>
       <w:r>
         <w:rPr>
@@ -3401,15 +3166,7 @@
         <w:t>U. J. F. Aarsnes</w:t>
       </w:r>
       <w:r>
-        <w:t xml:space="preserve">, H. </w:t>
-      </w:r>
-      <w:proofErr w:type="spellStart"/>
-      <w:r>
-        <w:t>Mahdianfar</w:t>
-      </w:r>
-      <w:proofErr w:type="spellEnd"/>
-      <w:r>
-        <w:t xml:space="preserve">, O. M. Aamo and A. Pavlov. “Rejection of Heave-Induced Pressure Oscillations in Managed Pressure Drilling," presented at the </w:t>
+        <w:t xml:space="preserve">, H. Mahdianfar, O. M. Aamo and A. Pavlov. “Rejection of Heave-Induced Pressure Oscillations in Managed Pressure Drilling," presented at the </w:t>
       </w:r>
       <w:r>
         <w:rPr>
@@ -3505,15 +3262,7 @@
         <w:jc w:val="both"/>
       </w:pPr>
       <w:r>
-        <w:t xml:space="preserve">A. </w:t>
-      </w:r>
-      <w:proofErr w:type="spellStart"/>
-      <w:r>
-        <w:t>Nikoofard</w:t>
-      </w:r>
-      <w:proofErr w:type="spellEnd"/>
-      <w:r>
-        <w:t xml:space="preserve">, </w:t>
+        <w:t xml:space="preserve">A. Nikoofard, </w:t>
       </w:r>
       <w:r>
         <w:rPr>
@@ -3567,15 +3316,7 @@
         <w:t>arimi</w:t>
       </w:r>
       <w:r>
-        <w:t xml:space="preserve"> </w:t>
-      </w:r>
-      <w:proofErr w:type="spellStart"/>
-      <w:r>
-        <w:t>Vajargah</w:t>
-      </w:r>
-      <w:proofErr w:type="spellEnd"/>
-      <w:r>
-        <w:t>, O. M. Aamo, and E. Van Oort, “</w:t>
+        <w:t xml:space="preserve"> Vajargah, O. M. Aamo, and E. Van Oort, “</w:t>
       </w:r>
       <w:r>
         <w:t>A Simplified Gas-Liquid Flow Model for Kick Mitigation and Control During Drilling Operations</w:t>
@@ -3626,15 +3367,7 @@
         <w:t>U. J. F. Aarsnes</w:t>
       </w:r>
       <w:r>
-        <w:t xml:space="preserve">, A. Karimi </w:t>
-      </w:r>
-      <w:proofErr w:type="spellStart"/>
-      <w:r>
-        <w:t>Vajargah</w:t>
-      </w:r>
-      <w:proofErr w:type="spellEnd"/>
-      <w:r>
-        <w:t xml:space="preserve"> and E. van Oort, “</w:t>
+        <w:t>, A. Karimi Vajargah and E. van Oort, “</w:t>
       </w:r>
       <w:r>
         <w:t>A Simplified Transient Multi-Phase Model for Automated Well Control Applications</w:t>
@@ -4120,15 +3853,7 @@
         </w:rPr>
       </w:pPr>
       <w:r>
-        <w:t xml:space="preserve">P. </w:t>
-      </w:r>
-      <w:proofErr w:type="spellStart"/>
-      <w:r>
-        <w:t>Pastusek</w:t>
-      </w:r>
-      <w:proofErr w:type="spellEnd"/>
-      <w:r>
-        <w:t xml:space="preserve">, G. Payette, R. Shor, E. Cayeux, </w:t>
+        <w:t xml:space="preserve">P. Pastusek, G. Payette, R. Shor, E. Cayeux, </w:t>
       </w:r>
       <w:r>
         <w:rPr>
@@ -4149,15 +3874,7 @@
         <w:t xml:space="preserve"> “</w:t>
       </w:r>
       <w:r>
-        <w:t xml:space="preserve">Creating </w:t>
-      </w:r>
-      <w:proofErr w:type="gramStart"/>
-      <w:r>
-        <w:t>Open Source</w:t>
-      </w:r>
-      <w:proofErr w:type="gramEnd"/>
-      <w:r>
-        <w:t xml:space="preserve"> Models, Test Cases, and Data for Oilfield Drilling Challenges</w:t>
+        <w:t>Creating Open Source Models, Test Cases, and Data for Oilfield Drilling Challenges</w:t>
       </w:r>
       <w:r>
         <w:t>”</w:t>
@@ -4616,6 +4333,38 @@
     </w:p>
     <w:p>
       <w:pPr>
+        <w:numPr>
+          <w:ilvl w:val="0"/>
+          <w:numId w:val="24"/>
+        </w:numPr>
+        <w:spacing w:before="120" w:after="120"/>
+        <w:jc w:val="both"/>
+      </w:pPr>
+      <w:r>
+        <w:t xml:space="preserve">M. Gkionis, O. M. Aamo, and </w:t>
+      </w:r>
+      <w:r>
+        <w:rPr>
+          <w:u w:val="single"/>
+        </w:rPr>
+        <w:t>U. J. F. Aarsnes</w:t>
+      </w:r>
+      <w:r>
+        <w:t xml:space="preserve">, “Real-Time Fault Detection and Diagnosis for Oil Well Drilling Using a Multitask Neural Network,” in </w:t>
+      </w:r>
+      <w:r>
+        <w:rPr>
+          <w:i/>
+        </w:rPr>
+        <w:t>Proceedings of the 22nd International Conference on Informatics in Control, Automation and Robotics (ICINCO)</w:t>
+      </w:r>
+      <w:r>
+        <w:t>, pp. 350–361, 2025.</w:t>
+      </w:r>
+    </w:p>
+    <w:p>
+      <w:pPr>
+        <w:spacing w:before="120"/>
         <w:rPr>
           <w:b/>
         </w:rPr>
@@ -4623,8 +4372,84 @@
       <w:r>
         <w:rPr>
           <w:b/>
-        </w:rPr>
-        <w:t>Selected Invited Talks</w:t>
+          <w:spacing w:val="-5"/>
+        </w:rPr>
+        <w:t>Preprints and Manuscripts Under Review</w:t>
+      </w:r>
+    </w:p>
+    <w:p>
+      <w:pPr>
+        <w:numPr>
+          <w:ilvl w:val="0"/>
+          <w:numId w:val="24"/>
+        </w:numPr>
+        <w:spacing w:before="120" w:after="120"/>
+        <w:jc w:val="both"/>
+      </w:pPr>
+      <w:r>
+        <w:t xml:space="preserve">A. Haïk and </w:t>
+      </w:r>
+      <w:r>
+        <w:rPr>
+          <w:u w:val="single"/>
+        </w:rPr>
+        <w:t>U. J. F. Aarsnes</w:t>
+      </w:r>
+      <w:r>
+        <w:t xml:space="preserve">, “Stochastic control of active PEMFC module count in hybrid vessels,” </w:t>
+      </w:r>
+      <w:r>
+        <w:rPr>
+          <w:i/>
+        </w:rPr>
+        <w:t>preprint</w:t>
+      </w:r>
+      <w:r>
+        <w:t>, SSRN 7353389, 2026.</w:t>
+      </w:r>
+    </w:p>
+    <w:p>
+      <w:pPr>
+        <w:numPr>
+          <w:ilvl w:val="0"/>
+          <w:numId w:val="24"/>
+        </w:numPr>
+        <w:spacing w:before="120" w:after="120"/>
+        <w:jc w:val="both"/>
+      </w:pPr>
+      <w:r>
+        <w:t xml:space="preserve">M. Gkionis, O. M. Aamo, </w:t>
+      </w:r>
+      <w:r>
+        <w:rPr>
+          <w:u w:val="single"/>
+        </w:rPr>
+        <w:t>U. J. F. Aarsnes</w:t>
+      </w:r>
+      <w:r>
+        <w:t xml:space="preserve">, and B. Grimstad, “Topside Measurements Only: Multitask Neural Networks for Real-Time Drilling Fault Detection and Diagnosis using Synthetic Transient Timeseries,” </w:t>
+      </w:r>
+      <w:r>
+        <w:rPr>
+          <w:i/>
+        </w:rPr>
+        <w:t>preprint</w:t>
+      </w:r>
+      <w:r>
+        <w:t>, SSRN 7004994, 2026.</w:t>
+      </w:r>
+    </w:p>
+    <w:p>
+      <w:pPr>
+        <w:rPr>
+          <w:b/>
+        </w:rPr>
+      </w:pPr>
+      <w:r>
+        <w:rPr>
+          <w:b/>
+        </w:rPr>
+        <w:t>Selected Talks</w:t>
       </w:r>
     </w:p>
     <w:p>
@@ -4635,40 +4460,29 @@
         </w:numPr>
       </w:pPr>
       <w:r>
-        <w:t>AVM Workshop</w:t>
-      </w:r>
-      <w:r>
-        <w:t xml:space="preserve">, </w:t>
-      </w:r>
-      <w:r>
-        <w:t>NTNU Business School</w:t>
-      </w:r>
-      <w:r>
-        <w:t>, Trondheim, Norway</w:t>
-      </w:r>
-      <w:r>
-        <w:tab/>
-      </w:r>
-      <w:r>
-        <w:tab/>
-      </w:r>
-      <w:r>
-        <w:tab/>
-      </w:r>
-      <w:r>
-        <w:tab/>
-      </w:r>
-      <w:r>
-        <w:tab/>
-      </w:r>
-      <w:r>
-        <w:t>Feb</w:t>
-      </w:r>
-      <w:r>
-        <w:t xml:space="preserve"> 20</w:t>
-      </w:r>
-      <w:r>
-        <w:t>24</w:t>
+        <w:t>IAME Conference 2025, NHH, Bergen, Norway</w:t>
+      </w:r>
+      <w:r>
+        <w:tab/>
+      </w:r>
+      <w:r>
+        <w:tab/>
+      </w:r>
+      <w:r>
+        <w:tab/>
+      </w:r>
+      <w:r>
+        <w:tab/>
+      </w:r>
+      <w:r>
+        <w:tab/>
+      </w:r>
+      <w:r>
+        <w:tab/>
+      </w:r>
+      <w:r>
+        <w:tab/>
+        <w:t>Jun 2025</w:t>
       </w:r>
     </w:p>
     <w:p>
@@ -4679,33 +4493,40 @@
         </w:numPr>
       </w:pPr>
       <w:r>
-        <w:t xml:space="preserve">Department of Mechanical Engineering, </w:t>
-      </w:r>
-      <w:proofErr w:type="spellStart"/>
-      <w:r>
-        <w:t>Technische</w:t>
-      </w:r>
-      <w:proofErr w:type="spellEnd"/>
-      <w:r>
-        <w:t xml:space="preserve"> Universiteit Eindhoven</w:t>
-      </w:r>
-      <w:r>
-        <w:t>, The Netherlands</w:t>
-      </w:r>
-      <w:r>
-        <w:tab/>
-      </w:r>
-      <w:r>
-        <w:tab/>
-      </w:r>
-      <w:r>
-        <w:t>Mar</w:t>
-      </w:r>
-      <w:r>
-        <w:t xml:space="preserve"> 201</w:t>
-      </w:r>
-      <w:r>
-        <w:t>9</w:t>
+        <w:t>AVM Workshop</w:t>
+      </w:r>
+      <w:r>
+        <w:t xml:space="preserve">, </w:t>
+      </w:r>
+      <w:r>
+        <w:t>NTNU Business School</w:t>
+      </w:r>
+      <w:r>
+        <w:t>, Trondheim, Norway</w:t>
+      </w:r>
+      <w:r>
+        <w:tab/>
+      </w:r>
+      <w:r>
+        <w:tab/>
+      </w:r>
+      <w:r>
+        <w:tab/>
+      </w:r>
+      <w:r>
+        <w:tab/>
+      </w:r>
+      <w:r>
+        <w:tab/>
+      </w:r>
+      <w:r>
+        <w:t>Feb</w:t>
+      </w:r>
+      <w:r>
+        <w:t xml:space="preserve"> 20</w:t>
+      </w:r>
+      <w:r>
+        <w:t>24</w:t>
       </w:r>
     </w:p>
     <w:p>
@@ -4716,25 +4537,19 @@
         </w:numPr>
       </w:pPr>
       <w:r>
-        <w:t>Geo-seminar, University of Minnesota, Minneapolis, MN, USA</w:t>
-      </w:r>
-      <w:r>
-        <w:tab/>
-      </w:r>
-      <w:r>
-        <w:tab/>
-      </w:r>
-      <w:r>
-        <w:tab/>
-      </w:r>
-      <w:r>
-        <w:tab/>
-      </w:r>
-      <w:r>
-        <w:tab/>
-      </w:r>
-      <w:r>
-        <w:t>Feb</w:t>
+        <w:t>Department of Mechanical Engineering, Technische Universiteit Eindhoven</w:t>
+      </w:r>
+      <w:r>
+        <w:t>, The Netherlands</w:t>
+      </w:r>
+      <w:r>
+        <w:tab/>
+      </w:r>
+      <w:r>
+        <w:tab/>
+      </w:r>
+      <w:r>
+        <w:t>Mar</w:t>
       </w:r>
       <w:r>
         <w:t xml:space="preserve"> 201</w:t>
@@ -4751,44 +4566,31 @@
         </w:numPr>
       </w:pPr>
       <w:r>
-        <w:t>SoCal Control Workshop</w:t>
-      </w:r>
-      <w:r>
-        <w:t xml:space="preserve">, </w:t>
-      </w:r>
-      <w:r>
-        <w:t>UCLA</w:t>
-      </w:r>
-      <w:r>
-        <w:t>, CA, USA</w:t>
-      </w:r>
-      <w:r>
-        <w:tab/>
-      </w:r>
-      <w:r>
-        <w:tab/>
-      </w:r>
-      <w:r>
-        <w:tab/>
-      </w:r>
-      <w:r>
-        <w:tab/>
-      </w:r>
-      <w:r>
-        <w:tab/>
-      </w:r>
-      <w:r>
-        <w:tab/>
-      </w:r>
-      <w:r>
-        <w:tab/>
-        <w:t>Nov</w:t>
+        <w:t>Geo-seminar, University of Minnesota, Minneapolis, MN, USA</w:t>
+      </w:r>
+      <w:r>
+        <w:tab/>
+      </w:r>
+      <w:r>
+        <w:tab/>
+      </w:r>
+      <w:r>
+        <w:tab/>
+      </w:r>
+      <w:r>
+        <w:tab/>
+      </w:r>
+      <w:r>
+        <w:tab/>
+      </w:r>
+      <w:r>
+        <w:t>Feb</w:t>
       </w:r>
       <w:r>
         <w:t xml:space="preserve"> 201</w:t>
       </w:r>
       <w:r>
-        <w:t>8</w:t>
+        <w:t>9</w:t>
       </w:r>
     </w:p>
     <w:p>
@@ -4799,23 +4601,44 @@
         </w:numPr>
       </w:pPr>
       <w:r>
-        <w:t>Energy, controls and applications lab, UC Berkeley, CA, USA</w:t>
-      </w:r>
-      <w:r>
-        <w:tab/>
-      </w:r>
-      <w:r>
-        <w:tab/>
-      </w:r>
-      <w:r>
-        <w:tab/>
-      </w:r>
-      <w:r>
-        <w:tab/>
-      </w:r>
-      <w:r>
-        <w:tab/>
-        <w:t>Sep 2016</w:t>
+        <w:t>SoCal Control Workshop</w:t>
+      </w:r>
+      <w:r>
+        <w:t xml:space="preserve">, </w:t>
+      </w:r>
+      <w:r>
+        <w:t>UCLA</w:t>
+      </w:r>
+      <w:r>
+        <w:t>, CA, USA</w:t>
+      </w:r>
+      <w:r>
+        <w:tab/>
+      </w:r>
+      <w:r>
+        <w:tab/>
+      </w:r>
+      <w:r>
+        <w:tab/>
+      </w:r>
+      <w:r>
+        <w:tab/>
+      </w:r>
+      <w:r>
+        <w:tab/>
+      </w:r>
+      <w:r>
+        <w:tab/>
+      </w:r>
+      <w:r>
+        <w:tab/>
+        <w:t>Nov</w:t>
+      </w:r>
+      <w:r>
+        <w:t xml:space="preserve"> 201</w:t>
+      </w:r>
+      <w:r>
+        <w:t>8</w:t>
       </w:r>
     </w:p>
     <w:p>
@@ -4826,34 +4649,10 @@
         </w:numPr>
       </w:pPr>
       <w:r>
-        <w:t xml:space="preserve">Department of </w:t>
-      </w:r>
-      <w:r>
-        <w:t>Chemical and Petroleum Engineering</w:t>
-      </w:r>
-      <w:r>
-        <w:t xml:space="preserve">, </w:t>
-      </w:r>
-      <w:r>
-        <w:t>U.</w:t>
-      </w:r>
-      <w:r>
-        <w:t xml:space="preserve"> </w:t>
-      </w:r>
-      <w:r>
-        <w:t>Calgary</w:t>
-      </w:r>
-      <w:r>
-        <w:t>,</w:t>
-      </w:r>
-      <w:r>
-        <w:t xml:space="preserve"> </w:t>
-      </w:r>
-      <w:r>
-        <w:t>C</w:t>
-      </w:r>
-      <w:r>
-        <w:t>anada</w:t>
+        <w:t>Energy, controls and applications lab, UC Berkeley, CA, USA</w:t>
+      </w:r>
+      <w:r>
+        <w:tab/>
       </w:r>
       <w:r>
         <w:tab/>
@@ -4877,23 +4676,47 @@
         </w:numPr>
       </w:pPr>
       <w:r>
-        <w:t>SPE Managed Pressure Drilling and Well Control Workshop, Rio, Brazil</w:t>
-      </w:r>
-      <w:r>
-        <w:tab/>
-      </w:r>
-      <w:r>
-        <w:tab/>
-      </w:r>
-      <w:r>
-        <w:tab/>
-      </w:r>
-      <w:r>
-        <w:tab/>
-        <w:t xml:space="preserve">Jul </w:t>
-      </w:r>
-      <w:r>
-        <w:t>2015</w:t>
+        <w:t xml:space="preserve">Department of </w:t>
+      </w:r>
+      <w:r>
+        <w:t>Chemical and Petroleum Engineering</w:t>
+      </w:r>
+      <w:r>
+        <w:t xml:space="preserve">, </w:t>
+      </w:r>
+      <w:r>
+        <w:t>U.</w:t>
+      </w:r>
+      <w:r>
+        <w:t xml:space="preserve"> </w:t>
+      </w:r>
+      <w:r>
+        <w:t>Calgary</w:t>
+      </w:r>
+      <w:r>
+        <w:t>,</w:t>
+      </w:r>
+      <w:r>
+        <w:t xml:space="preserve"> </w:t>
+      </w:r>
+      <w:r>
+        <w:t>C</w:t>
+      </w:r>
+      <w:r>
+        <w:t>anada</w:t>
+      </w:r>
+      <w:r>
+        <w:tab/>
+      </w:r>
+      <w:r>
+        <w:tab/>
+      </w:r>
+      <w:r>
+        <w:tab/>
+      </w:r>
+      <w:r>
+        <w:tab/>
+        <w:t>Sep 2016</w:t>
       </w:r>
     </w:p>
     <w:p>
@@ -4904,6 +4727,34 @@
         </w:numPr>
       </w:pPr>
       <w:r>
+        <w:t>SPE Managed Pressure Drilling and Well Control Workshop, Rio, Brazil</w:t>
+      </w:r>
+      <w:r>
+        <w:tab/>
+      </w:r>
+      <w:r>
+        <w:tab/>
+      </w:r>
+      <w:r>
+        <w:tab/>
+      </w:r>
+      <w:r>
+        <w:tab/>
+        <w:t xml:space="preserve">Jul </w:t>
+      </w:r>
+      <w:r>
+        <w:t>2015</w:t>
+      </w:r>
+    </w:p>
+    <w:p>
+      <w:pPr>
+        <w:numPr>
+          <w:ilvl w:val="0"/>
+          <w:numId w:val="11"/>
+        </w:numPr>
+      </w:pPr>
+      <w:r>
+        <w:lastRenderedPageBreak/>
         <w:t>SINTEF Materials and Chemistry, Trondheim, Norway</w:t>
       </w:r>
       <w:r>
@@ -5028,24 +4879,17 @@
           <w:b/>
         </w:rPr>
       </w:pPr>
-      <w:proofErr w:type="spellStart"/>
       <w:r>
         <w:t>Servom</w:t>
       </w:r>
-      <w:proofErr w:type="spellEnd"/>
       <w:r>
         <w:rPr>
           <w:lang w:val="nb-NO"/>
         </w:rPr>
         <w:t>ø</w:t>
       </w:r>
-      <w:proofErr w:type="spellStart"/>
-      <w:r>
-        <w:t>tet</w:t>
-      </w:r>
-      <w:proofErr w:type="spellEnd"/>
-      <w:r>
-        <w:t>, Trondheim, Norway</w:t>
+      <w:r>
+        <w:t>tet, Trondheim, Norway</w:t>
       </w:r>
       <w:r>
         <w:tab/>
@@ -5104,58 +4948,30 @@
         <w:rPr>
           <w:lang w:val="en-CA"/>
         </w:rPr>
-        <w:t xml:space="preserve">United States Provisional Patent </w:t>
-      </w:r>
-      <w:proofErr w:type="spellStart"/>
+        <w:t xml:space="preserve">United States Provisional Patent Appln No. </w:t>
+      </w:r>
+      <w:r>
+        <w:t>17/055,825</w:t>
+      </w:r>
       <w:r>
         <w:rPr>
           <w:lang w:val="en-CA"/>
         </w:rPr>
-        <w:t>Appln</w:t>
-      </w:r>
-      <w:proofErr w:type="spellEnd"/>
+        <w:t xml:space="preserve"> </w:t>
+      </w:r>
       <w:r>
         <w:rPr>
           <w:lang w:val="en-CA"/>
         </w:rPr>
-        <w:t xml:space="preserve"> No. </w:t>
-      </w:r>
-      <w:r>
-        <w:t>17/055,825</w:t>
-      </w:r>
+        <w:t>(Provisional application)</w:t>
+      </w:r>
+    </w:p>
+    <w:p>
       <w:r>
         <w:rPr>
           <w:lang w:val="en-CA"/>
         </w:rPr>
-        <w:t xml:space="preserve"> </w:t>
-      </w:r>
-      <w:r>
-        <w:rPr>
-          <w:lang w:val="en-CA"/>
-        </w:rPr>
-        <w:t>(Provisional application)</w:t>
-      </w:r>
-    </w:p>
-    <w:p>
-      <w:r>
-        <w:rPr>
-          <w:lang w:val="en-CA"/>
-        </w:rPr>
-        <w:t xml:space="preserve">System and method for estimating distributed static and kinematic friction, torque and rpm along a </w:t>
-      </w:r>
-      <w:proofErr w:type="spellStart"/>
-      <w:r>
-        <w:rPr>
-          <w:lang w:val="en-CA"/>
-        </w:rPr>
-        <w:t>drillstring</w:t>
-      </w:r>
-      <w:proofErr w:type="spellEnd"/>
-      <w:r>
-        <w:rPr>
-          <w:lang w:val="en-CA"/>
-        </w:rPr>
-        <w:t xml:space="preserve"> in a wellbore</w:t>
+        <w:t>System and method for estimating distributed static and kinematic friction, torque and rpm along a drillstring in a wellbore</w:t>
       </w:r>
     </w:p>
     <w:p>
@@ -5225,7 +5041,6 @@
           <w:i w:val="0"/>
           <w:u w:val="single"/>
         </w:rPr>
-        <w:lastRenderedPageBreak/>
         <w:t>Funding Awards</w:t>
       </w:r>
       <w:r>
@@ -5264,38 +5079,24 @@
         <w:rPr>
           <w:b/>
         </w:rPr>
-        <w:t xml:space="preserve">Marie </w:t>
-      </w:r>
-      <w:proofErr w:type="spellStart"/>
+        <w:t xml:space="preserve">Marie Skłodowska-Curie Action (MSCA) </w:t>
+      </w:r>
       <w:r>
         <w:rPr>
           <w:b/>
         </w:rPr>
-        <w:t>Skłodowska</w:t>
-      </w:r>
-      <w:proofErr w:type="spellEnd"/>
+        <w:t xml:space="preserve">Individual </w:t>
+      </w:r>
       <w:r>
         <w:rPr>
           <w:b/>
         </w:rPr>
-        <w:t xml:space="preserve">-Curie Action (MSCA) </w:t>
+        <w:t>Fellow</w:t>
       </w:r>
       <w:r>
         <w:rPr>
           <w:b/>
         </w:rPr>
-        <w:t xml:space="preserve">Individual </w:t>
-      </w:r>
-      <w:r>
-        <w:rPr>
-          <w:b/>
-        </w:rPr>
-        <w:t>Fellow</w:t>
-      </w:r>
-      <w:r>
-        <w:rPr>
-          <w:b/>
-        </w:rPr>
         <w:t>ship</w:t>
       </w:r>
       <w:r>
@@ -5346,21 +5147,7 @@
         <w:rPr>
           <w:i/>
         </w:rPr>
-        <w:t xml:space="preserve">Norwegian Research Council, Marie </w:t>
-      </w:r>
-      <w:proofErr w:type="spellStart"/>
-      <w:r>
-        <w:rPr>
-          <w:i/>
-        </w:rPr>
-        <w:t>Skłodowska</w:t>
-      </w:r>
-      <w:proofErr w:type="spellEnd"/>
-      <w:r>
-        <w:rPr>
-          <w:i/>
-        </w:rPr>
-        <w:t>-Curie actions</w:t>
+        <w:t>Norwegian Research Council, Marie Skłodowska-Curie actions</w:t>
       </w:r>
       <w:r>
         <w:t>.</w:t>
@@ -5454,21 +5241,12 @@
         </w:rPr>
         <w:t xml:space="preserve">SFI </w:t>
       </w:r>
-      <w:proofErr w:type="spellStart"/>
       <w:r>
         <w:rPr>
           <w:b/>
           <w:lang w:val="en-GB"/>
         </w:rPr>
-        <w:t>Center</w:t>
-      </w:r>
-      <w:proofErr w:type="spellEnd"/>
-      <w:r>
-        <w:rPr>
-          <w:b/>
-          <w:lang w:val="en-GB"/>
-        </w:rPr>
-        <w:t xml:space="preserve"> for Research-based Innovation</w:t>
+        <w:t>Center for Research-based Innovation</w:t>
       </w:r>
       <w:r>
         <w:rPr>
@@ -6101,21 +5879,7 @@
         <w:rPr>
           <w:i/>
         </w:rPr>
-        <w:t>Energy efficient operation of hydrogen powered vessels (</w:t>
-      </w:r>
-      <w:proofErr w:type="spellStart"/>
-      <w:r>
-        <w:rPr>
-          <w:i/>
-        </w:rPr>
-        <w:t>HyEff</w:t>
-      </w:r>
-      <w:proofErr w:type="spellEnd"/>
-      <w:r>
-        <w:rPr>
-          <w:i/>
-        </w:rPr>
-        <w:t>)</w:t>
+        <w:t>Energy efficient operation of hydrogen powered vessels (HyEff)</w:t>
       </w:r>
     </w:p>
     <w:p>
@@ -6321,58 +6085,8 @@
         <w:rPr>
           <w:i/>
         </w:rPr>
-        <w:t xml:space="preserve">Ocean Charger – </w:t>
-      </w:r>
-      <w:proofErr w:type="spellStart"/>
-      <w:r>
-        <w:rPr>
-          <w:i/>
-        </w:rPr>
-        <w:t>maritim</w:t>
-      </w:r>
-      <w:proofErr w:type="spellEnd"/>
-      <w:r>
-        <w:rPr>
-          <w:i/>
-        </w:rPr>
-        <w:t xml:space="preserve"> </w:t>
-      </w:r>
-      <w:proofErr w:type="spellStart"/>
-      <w:r>
-        <w:rPr>
-          <w:i/>
-        </w:rPr>
-        <w:t>verdikjede</w:t>
-      </w:r>
-      <w:proofErr w:type="spellEnd"/>
-      <w:r>
-        <w:rPr>
-          <w:i/>
-        </w:rPr>
-        <w:t xml:space="preserve"> for </w:t>
-      </w:r>
-      <w:proofErr w:type="spellStart"/>
-      <w:r>
-        <w:rPr>
-          <w:i/>
-        </w:rPr>
-        <w:t>havvind</w:t>
-      </w:r>
-      <w:proofErr w:type="spellEnd"/>
-      <w:r>
-        <w:rPr>
-          <w:i/>
-        </w:rPr>
-        <w:t xml:space="preserve"> med offshore </w:t>
-      </w:r>
-      <w:proofErr w:type="spellStart"/>
-      <w:r>
-        <w:rPr>
-          <w:i/>
-        </w:rPr>
-        <w:t>energioverføring</w:t>
-      </w:r>
-      <w:proofErr w:type="spellEnd"/>
+        <w:t>Ocean Charger – maritim verdikjede for havvind med offshore energioverføring</w:t>
+      </w:r>
     </w:p>
     <w:p>
       <w:pPr>
@@ -6710,18 +6424,8 @@
           <w:i w:val="0"/>
           <w:u w:val="single"/>
         </w:rPr>
-        <w:t xml:space="preserve">Teaching and supervision </w:t>
-      </w:r>
-      <w:proofErr w:type="spellStart"/>
-      <w:r>
-        <w:rPr>
-          <w:rFonts w:ascii="Times New Roman" w:hAnsi="Times New Roman"/>
-          <w:i w:val="0"/>
-          <w:u w:val="single"/>
-        </w:rPr>
-        <w:t>activitites</w:t>
-      </w:r>
-      <w:proofErr w:type="spellEnd"/>
+        <w:t>Teaching and supervision activitites</w:t>
+      </w:r>
     </w:p>
     <w:p>
       <w:pPr>
@@ -6859,6 +6563,7 @@
           <w:iCs/>
           <w:szCs w:val="24"/>
         </w:rPr>
+        <w:lastRenderedPageBreak/>
         <w:t>Examiner</w:t>
       </w:r>
       <w:r>
@@ -7162,11 +6867,7 @@
         <w:t xml:space="preserve">, </w:t>
       </w:r>
       <w:r>
-        <w:t xml:space="preserve">Journal of </w:t>
-      </w:r>
-      <w:r>
-        <w:lastRenderedPageBreak/>
-        <w:t>Process Control</w:t>
+        <w:t>Journal of Process Control</w:t>
       </w:r>
       <w:r>
         <w:t xml:space="preserve">, </w:t>
@@ -7184,13 +6885,8 @@
         <w:t>.</w:t>
       </w:r>
       <w:r>
-        <w:t xml:space="preserve"> </w:t>
-      </w:r>
-      <w:proofErr w:type="spellStart"/>
-      <w:r>
-        <w:t>Automatica</w:t>
-      </w:r>
-      <w:proofErr w:type="spellEnd"/>
+        <w:t xml:space="preserve"> Automatica</w:t>
+      </w:r>
       <w:r>
         <w:t>, Meccanica</w:t>
       </w:r>
@@ -7394,15 +7090,7 @@
         <w:t xml:space="preserve"> Artificial Intelligence Research Consortium</w:t>
       </w:r>
       <w:r>
-        <w:t xml:space="preserve"> innovation network (</w:t>
-      </w:r>
-      <w:proofErr w:type="spellStart"/>
-      <w:r>
-        <w:t>NORA.startup</w:t>
-      </w:r>
-      <w:proofErr w:type="spellEnd"/>
-      <w:r>
-        <w:t>)</w:t>
+        <w:t xml:space="preserve"> innovation network (NORA.startup)</w:t>
       </w:r>
       <w:r>
         <w:t xml:space="preserve"> </w:t>
@@ -7511,7 +7199,35 @@
         <w:noProof/>
         <w:color w:val="404040" w:themeColor="text1" w:themeTint="BF"/>
       </w:rPr>
-      <w:t>Last updated: 16.02.202</w:t>
+      <w:t xml:space="preserve">Last updated: </w:t>
+    </w:r>
+    <w:r>
+      <w:rPr>
+        <w:noProof/>
+        <w:color w:val="404040" w:themeColor="text1" w:themeTint="BF"/>
+      </w:rPr>
+      <w:t>22</w:t>
+    </w:r>
+    <w:r>
+      <w:rPr>
+        <w:noProof/>
+        <w:color w:val="404040" w:themeColor="text1" w:themeTint="BF"/>
+      </w:rPr>
+      <w:t>.0</w:t>
+    </w:r>
+    <w:r>
+      <w:rPr>
+        <w:noProof/>
+        <w:color w:val="404040" w:themeColor="text1" w:themeTint="BF"/>
+      </w:rPr>
+      <w:t>9</w:t>
+    </w:r>
+    <w:r>
+      <w:rPr>
+        <w:noProof/>
+        <w:color w:val="404040" w:themeColor="text1" w:themeTint="BF"/>
+      </w:rPr>
+      <w:t>.202</w:t>
     </w:r>
     <w:r>
       <w:rPr>
@@ -11337,7 +11053,6 @@
   <w:style w:type="character" w:default="1" w:styleId="DefaultParagraphFont">
     <w:name w:val="Default Paragraph Font"/>
     <w:uiPriority w:val="1"/>
-    <w:semiHidden/>
     <w:unhideWhenUsed/>
   </w:style>
   <w:style w:type="table" w:default="1" w:styleId="TableNormal">

</xml_diff>